<commit_message>
Vector Store practice with FAISS
</commit_message>
<xml_diff>
--- a/sample_files/office/sample_proposal.docx
+++ b/sample_files/office/sample_proposal.docx
@@ -12,7 +12,7 @@
     </w:p>
     <w:p>
       <w:r>
-        <w:t>This DOCX file is included for loader and parser experiments.</w:t>
+        <w:t>This DOCX file is included for loader experiments.</w:t>
       </w:r>
     </w:p>
     <w:p>
@@ -28,7 +28,7 @@
         <w:pStyle w:val="ListBullet"/>
       </w:pPr>
       <w:r>
-        <w:t>Ingest mixed document formats</w:t>
+        <w:t>Ingest mixed formats</w:t>
       </w:r>
     </w:p>
     <w:p>
@@ -36,7 +36,7 @@
         <w:pStyle w:val="ListBullet"/>
       </w:pPr>
       <w:r>
-        <w:t>Store metadata for filtering</w:t>
+        <w:t>Store metadata</w:t>
       </w:r>
     </w:p>
     <w:p>
@@ -44,20 +44,7 @@
         <w:pStyle w:val="ListBullet"/>
       </w:pPr>
       <w:r>
-        <w:t>Enable semantic retrieval with citations</w:t>
-      </w:r>
-    </w:p>
-    <w:p>
-      <w:pPr>
-        <w:pStyle w:val="Heading1"/>
-      </w:pPr>
-      <w:r>
-        <w:t>Notes</w:t>
-      </w:r>
-    </w:p>
-    <w:p>
-      <w:r>
-        <w:t>Use this file to test DOCX loading, text extraction, and metadata capture.</w:t>
+        <w:t>Enable retrieval with citations</w:t>
       </w:r>
     </w:p>
     <w:sectPr>

</xml_diff>